<commit_message>
fix: machine master normalization (hokuto, valvrave2 duplicates resolved)
</commit_message>
<xml_diff>
--- a/docs/SlotSettingAnalyzer_#U8a73#U7d30#U8a2d#U8a08#U66f8_v0_4.docx
+++ b/docs/SlotSettingAnalyzer_#U8a73#U7d30#U8a2d#U8a08#U66f8_v0_4.docx
@@ -5350,6 +5350,90 @@
         <w:t>今後は、広告導入、マスタ配信の外部化、設定推測ロジックの重み付け強化、機種別専用入力UI、履歴の絞り込み/タグ付け、CSV出力などが拡張候補になる。現時点では“現場で素早く入力して推測確認する”という主目的に対して、十分に一本筋の通った構成になっている。</w:t>
       </w:r>
     </w:p>
+    <w:p>
+      <w:r>
+        <w:br w:type="page"/>
+      </w:r>
+    </w:p>
+    <w:p>
+      <w:pPr>
+        <w:pStyle w:val="Heading1"/>
+      </w:pPr>
+      <w:r>
+        <w:t>2026-04-01 追記: 機種マスター運用更新</w:t>
+      </w:r>
+    </w:p>
+    <w:p>
+      <w:r>
+        <w:t>本追記は、JSON追加後に一部機種が表示されない事象と、近い名前の後継機が既存機種へ誤吸収される事象に対応するための運用更新をまとめたものである。</w:t>
+      </w:r>
+    </w:p>
+    <w:p>
+      <w:pPr>
+        <w:pStyle w:val="Heading2"/>
+      </w:pPr>
+      <w:r>
+        <w:t>更新内容</w:t>
+      </w:r>
+    </w:p>
+    <w:p>
+      <w:pPr>
+        <w:pStyle w:val="ListBullet"/>
+      </w:pPr>
+      <w:r>
+        <w:t>機種名はメーカー正式名称を正本とし、表示名の統一基準として扱う。</w:t>
+      </w:r>
+    </w:p>
+    <w:p>
+      <w:pPr>
+        <w:pStyle w:val="ListBullet"/>
+      </w:pPr>
+      <w:r>
+        <w:t>機種追加判定は近似一致ではなく完全一致で扱う。</w:t>
+      </w:r>
+    </w:p>
+    <w:p>
+      <w:pPr>
+        <w:pStyle w:val="ListBullet"/>
+      </w:pPr>
+      <w:r>
+        <w:t>続編・派生機（例: 北斗の拳 転生の章2、革命機ヴァルヴレイヴ2）は既存機種と別JSONで管理する。</w:t>
+      </w:r>
+    </w:p>
+    <w:p>
+      <w:pPr>
+        <w:pStyle w:val="ListBullet"/>
+      </w:pPr>
+      <w:r>
+        <w:t>manifest登録に加えて assets 配下の機種JSON自動検出を利用し、version更新漏れでも取り込みを補完する。</w:t>
+      </w:r>
+    </w:p>
+    <w:p>
+      <w:pPr>
+        <w:pStyle w:val="ListBullet"/>
+      </w:pPr>
+      <w:r>
+        <w:t>追加した新規機種で設定差の参照値が未整備な場合は、入力UIのみ先行投入し、推測結果では未使用と明記する。</w:t>
+      </w:r>
+    </w:p>
+    <w:p>
+      <w:pPr>
+        <w:pStyle w:val="Heading2"/>
+      </w:pPr>
+      <w:r>
+        <w:t>今回の対象</w:t>
+      </w:r>
+    </w:p>
+    <w:p>
+      <w:r>
+        <w:t>新規追加: スマスロ 北斗の拳 転生の章2 / Lパチスロ 革命機ヴァルヴレイヴ2</w:t>
+      </w:r>
+    </w:p>
+    <w:p>
+      <w:r>
+        <w:t>名称正規化例: L北斗の拳 / パチスロ 甲鉄城のカバネリ / スマスロ モンキーターンV</w:t>
+      </w:r>
+    </w:p>
     <w:sectPr>
       <w:pgSz w:w="12240" w:h="15840"/>
       <w:pgMar w:top="1020" w:right="1134" w:bottom="907" w:left="1134" w:header="720" w:footer="720" w:gutter="0"/>

</xml_diff>